<commit_message>
Centraliza todas as colunas dos quadros da Seção 1
</commit_message>
<xml_diff>
--- a/secoes/01_Recurso_Solar/producao/manuscritos/1_1_Geometria_Solar.docx
+++ b/secoes/01_Recurso_Solar/producao/manuscritos/1_1_Geometria_Solar.docx
@@ -5177,7 +5177,7 @@
               <w:widowControl/>
               <w:spacing w:line="240" w:lineRule="auto" w:after="0"/>
               <w:ind w:firstLine="0"/>
-              <w:jc w:val="left"/>
+              <w:jc w:val="center"/>
             </w:pPr>
             <w:r>
               <w:rPr>
@@ -5278,7 +5278,7 @@
               <w:widowControl/>
               <w:spacing w:line="240" w:lineRule="auto" w:after="0"/>
               <w:ind w:firstLine="0"/>
-              <w:jc w:val="left"/>
+              <w:jc w:val="center"/>
             </w:pPr>
             <w:r>
               <w:rPr>
@@ -5378,7 +5378,7 @@
               <w:widowControl/>
               <w:spacing w:line="240" w:lineRule="auto" w:after="0"/>
               <w:ind w:firstLine="0"/>
-              <w:jc w:val="left"/>
+              <w:jc w:val="center"/>
             </w:pPr>
             <w:r>
               <w:rPr>
@@ -5478,7 +5478,7 @@
               <w:widowControl/>
               <w:spacing w:line="240" w:lineRule="auto" w:after="0"/>
               <w:ind w:firstLine="0"/>
-              <w:jc w:val="left"/>
+              <w:jc w:val="center"/>
             </w:pPr>
             <w:r>
               <w:rPr>
@@ -5591,7 +5591,7 @@
               <w:widowControl/>
               <w:spacing w:line="240" w:lineRule="auto" w:after="0"/>
               <w:ind w:firstLine="0"/>
-              <w:jc w:val="left"/>
+              <w:jc w:val="center"/>
             </w:pPr>
             <w:r>
               <w:rPr>
@@ -5704,7 +5704,7 @@
               <w:widowControl/>
               <w:spacing w:line="240" w:lineRule="auto" w:after="0"/>
               <w:ind w:firstLine="0"/>
-              <w:jc w:val="left"/>
+              <w:jc w:val="center"/>
             </w:pPr>
             <w:r>
               <w:rPr>
@@ -5889,7 +5889,7 @@
               <w:widowControl/>
               <w:spacing w:line="240" w:lineRule="auto" w:after="0"/>
               <w:ind w:firstLine="0"/>
-              <w:jc w:val="left"/>
+              <w:jc w:val="center"/>
             </w:pPr>
             <w:r>
               <w:rPr>
@@ -6009,7 +6009,7 @@
               <w:widowControl/>
               <w:spacing w:line="240" w:lineRule="auto" w:after="0"/>
               <w:ind w:firstLine="0"/>
-              <w:jc w:val="left"/>
+              <w:jc w:val="center"/>
             </w:pPr>
             <w:r>
               <w:rPr>
@@ -6110,7 +6110,7 @@
               <w:widowControl/>
               <w:spacing w:line="240" w:lineRule="auto" w:after="0"/>
               <w:ind w:firstLine="0"/>
-              <w:jc w:val="left"/>
+              <w:jc w:val="center"/>
             </w:pPr>
             <w:r>
               <w:rPr>

</xml_diff>

<commit_message>
Ajusta entrelinhas, itálicos e dimensões das figuras da Seção 1
</commit_message>
<xml_diff>
--- a/secoes/01_Recurso_Solar/producao/manuscritos/1_1_Geometria_Solar.docx
+++ b/secoes/01_Recurso_Solar/producao/manuscritos/1_1_Geometria_Solar.docx
@@ -1829,7 +1829,7 @@
         <w:keepNext/>
         <w:widowControl/>
         <w:spacing w:line="240" w:lineRule="auto" w:after="80" w:before="160"/>
-        <w:ind w:firstLine="0" w:left="227" w:right="227"/>
+        <w:ind w:firstLine="0" w:left="709" w:right="709"/>
         <w:jc w:val="center"/>
       </w:pPr>
       <w:r>
@@ -1855,7 +1855,7 @@
       <w:r>
         <w:drawing>
           <wp:inline>
-            <wp:extent cx="5472000" cy="2901680"/>
+            <wp:extent cx="4860000" cy="2577150"/>
             <wp:docPr id="25" name="Picture 25" descr="Figura 1 – Geometria solar local e convenção azimutal" title="Figura 1 – Geometria solar local e convenção azimutal"/>
             <wp:cNvGraphicFramePr>
               <a:graphicFrameLocks noChangeAspect="1"/>
@@ -1882,7 +1882,7 @@
                   <pic:spPr>
                     <a:xfrm>
                       <a:off x="0" y="0"/>
-                      <a:ext cx="5472000" cy="2901680"/>
+                      <a:ext cx="4860000" cy="2577150"/>
                     </a:xfrm>
                     <a:prstGeom prst="rect"/>
                   </pic:spPr>
@@ -1899,7 +1899,7 @@
         <w:keepNext w:val="0"/>
         <w:widowControl/>
         <w:spacing w:line="240" w:lineRule="auto" w:after="160" w:before="60"/>
-        <w:ind w:firstLine="0" w:left="227" w:right="227"/>
+        <w:ind w:firstLine="0" w:left="709" w:right="709"/>
         <w:jc w:val="left"/>
       </w:pPr>
       <w:r>
@@ -2634,7 +2634,17 @@
         <w:ind w:firstLine="709"/>
       </w:pPr>
       <w:r>
-        <w:t>O fator orbital da aproximação de Spencer implementada no pvlib 0.16.1 é expresso pela equação (4) (PVLIB CONTRIBUTORS, 2026):</w:t>
+        <w:t xml:space="preserve">O fator orbital da aproximação de Spencer implementada no </w:t>
+      </w:r>
+      <w:r>
+        <w:rPr>
+          <w:i w:val="1"/>
+          <w:iCs w:val="1"/>
+        </w:rPr>
+        <w:t xml:space="preserve">pvlib</w:t>
+      </w:r>
+      <w:r>
+        <w:t xml:space="preserve"> 0.16.1 é expresso pela equação (4) (PVLIB CONTRIBUTORS, 2026):</w:t>
       </w:r>
     </w:p>
     <w:p>
@@ -3376,7 +3386,26 @@
           <w:color w:val="000000"/>
           <w:sz w:val="24"/>
         </w:rPr>
-        <w:t xml:space="preserve">. O denominador 365 é mantido em 2024 para reproduzir a implementação conferida do pvlib.</w:t>
+        <w:t xml:space="preserve">. O denominador 365 é mantido em 2024 para reproduzir a implementação conferida do </w:t>
+      </w:r>
+      <w:r>
+        <w:rPr>
+          <w:rFonts w:ascii="Times New Roman" w:hAnsi="Times New Roman"/>
+          <w:i w:val="1"/>
+          <w:color w:val="000000"/>
+          <w:sz w:val="24"/>
+          <w:iCs w:val="1"/>
+        </w:rPr>
+        <w:t xml:space="preserve">pvlib</w:t>
+      </w:r>
+      <w:r>
+        <w:rPr>
+          <w:rFonts w:ascii="Times New Roman" w:hAnsi="Times New Roman"/>
+          <w:i w:val="0"/>
+          <w:color w:val="000000"/>
+          <w:sz w:val="24"/>
+        </w:rPr>
+        <w:t xml:space="preserve">.</w:t>
       </w:r>
     </w:p>
     <w:p>
@@ -4367,7 +4396,26 @@
           <w:color w:val="000000"/>
           <w:sz w:val="24"/>
         </w:rPr>
-        <w:t xml:space="preserve">. Sua interpretação física é útil: próximo ao horizonte, o trajeto atmosférico é, em geral, mais extenso, o que amplia as oportunidades de absorção e espalhamento. Entretanto, a aproximação secante perde validade para grandes ângulos zenitais. Para aplicações quantitativas, deve-se empregar uma parametrização de massa de ar apropriada, distinguindo a massa de ar relativa da absoluta e informando eventuais correções de pressão (DUFFIE; BECKMAN; BLAIR, 2020, p. 9–10; SENGUPTA et al., 2024, cap. 2, p. 6–8).</w:t>
+        <w:t xml:space="preserve">. Sua interpretação física é útil: próximo ao horizonte, o trajeto atmosférico é, em geral, mais extenso, o que amplia as oportunidades de absorção e espalhamento. Entretanto, a aproximação secante perde validade para grandes ângulos zenitais. Para aplicações quantitativas, deve-se empregar uma parametrização de massa de ar apropriada, distinguindo a massa de ar relativa da absoluta e informando eventuais correções de pressão (DUFFIE; BECKMAN; BLAIR, 2020, p. 9–10; SENGUPTA </w:t>
+      </w:r>
+      <w:r>
+        <w:rPr>
+          <w:rFonts w:ascii="Times New Roman" w:hAnsi="Times New Roman"/>
+          <w:i w:val="1"/>
+          <w:color w:val="000000"/>
+          <w:sz w:val="24"/>
+          <w:iCs w:val="1"/>
+        </w:rPr>
+        <w:t xml:space="preserve">et al.</w:t>
+      </w:r>
+      <w:r>
+        <w:rPr>
+          <w:rFonts w:ascii="Times New Roman" w:hAnsi="Times New Roman"/>
+          <w:i w:val="0"/>
+          <w:color w:val="000000"/>
+          <w:sz w:val="24"/>
+        </w:rPr>
+        <w:t xml:space="preserve">, 2024, cap. 2, p. 6–8).</w:t>
       </w:r>
     </w:p>
     <w:p>
@@ -4438,11 +4486,23 @@
           <w:rFonts w:ascii="Times New Roman" w:hAnsi="Times New Roman"/>
           <w:b/>
           <w:bCs/>
-          <w:i w:val="0"/>
-          <w:color w:val="000000"/>
-          <w:sz w:val="24"/>
-        </w:rPr>
-        <w:t xml:space="preserve">Farm Solar Array — PVDAQ 2107</w:t>
+          <w:i w:val="1"/>
+          <w:color w:val="000000"/>
+          <w:sz w:val="24"/>
+          <w:iCs w:val="1"/>
+        </w:rPr>
+        <w:t xml:space="preserve">Farm Solar Array</w:t>
+      </w:r>
+      <w:r>
+        <w:rPr>
+          <w:rFonts w:ascii="Times New Roman" w:hAnsi="Times New Roman"/>
+          <w:b/>
+          <w:bCs/>
+          <w:i w:val="0"/>
+          <w:color w:val="000000"/>
+          <w:sz w:val="24"/>
+        </w:rPr>
+        <w:t xml:space="preserve"> — PVDAQ 2107</w:t>
       </w:r>
       <w:r>
         <w:rPr>
@@ -4651,8 +4711,8 @@
       <w:r>
         <w:rPr>
           <w:rFonts w:ascii="Times New Roman" w:hAnsi="Times New Roman"/>
-          <w:i w:val="0"/>
-          <w:iCs/>
+          <w:i w:val="1"/>
+          <w:iCs w:val="1"/>
           <w:color w:val="000000"/>
           <w:sz w:val="24"/>
         </w:rPr>
@@ -4673,7 +4733,7 @@
         <w:keepNext/>
         <w:widowControl/>
         <w:spacing w:line="240" w:lineRule="auto" w:after="80" w:before="160"/>
-        <w:ind w:firstLine="0" w:left="227" w:right="227"/>
+        <w:ind w:firstLine="0" w:left="709" w:right="709"/>
         <w:jc w:val="center"/>
       </w:pPr>
       <w:r>
@@ -4699,7 +4759,7 @@
       <w:r>
         <w:drawing>
           <wp:inline>
-            <wp:extent cx="5472000" cy="3062800"/>
+            <wp:extent cx="4860000" cy="2720250"/>
             <wp:docPr id="26" name="Picture 26" descr="Figura 2 – POA observada e ângulos solares no PVDAQ 2107" title="Figura 2 – POA observada e ângulos solares no PVDAQ 2107"/>
             <wp:cNvGraphicFramePr>
               <a:graphicFrameLocks noChangeAspect="1"/>
@@ -4726,7 +4786,7 @@
                   <pic:spPr>
                     <a:xfrm>
                       <a:off x="0" y="0"/>
-                      <a:ext cx="5472000" cy="3062800"/>
+                      <a:ext cx="4860000" cy="2720250"/>
                     </a:xfrm>
                     <a:prstGeom prst="rect"/>
                   </pic:spPr>
@@ -4743,7 +4803,7 @@
         <w:keepNext w:val="0"/>
         <w:widowControl/>
         <w:spacing w:line="240" w:lineRule="auto" w:after="160" w:before="60"/>
-        <w:ind w:firstLine="0" w:left="227" w:right="227"/>
+        <w:ind w:firstLine="0" w:left="709" w:right="709"/>
         <w:jc w:val="left"/>
       </w:pPr>
       <w:r>
@@ -4754,7 +4814,28 @@
           <w:color w:val="000000"/>
           <w:sz w:val="20"/>
         </w:rPr>
-        <w:t xml:space="preserve">Fonte: dados PVDAQ 2107 (Deline et al., 2021); elaboração do autor (2026).</w:t>
+        <w:t xml:space="preserve">Fonte: dados PVDAQ 2107 (Deline </w:t>
+      </w:r>
+      <w:r>
+        <w:rPr>
+          <w:rFonts w:ascii="Times New Roman" w:hAnsi="Times New Roman"/>
+          <w:b w:val="0"/>
+          <w:i w:val="1"/>
+          <w:color w:val="000000"/>
+          <w:sz w:val="20"/>
+          <w:iCs w:val="1"/>
+        </w:rPr>
+        <w:t xml:space="preserve">et al.</w:t>
+      </w:r>
+      <w:r>
+        <w:rPr>
+          <w:rFonts w:ascii="Times New Roman" w:hAnsi="Times New Roman"/>
+          <w:b w:val="0"/>
+          <w:i w:val="0"/>
+          <w:color w:val="000000"/>
+          <w:sz w:val="20"/>
+        </w:rPr>
+        <w:t xml:space="preserve">, 2021); elaboração do autor (2026).</w:t>
       </w:r>
     </w:p>
     <w:p>
@@ -4771,7 +4852,45 @@
           <w:color w:val="000000"/>
           <w:sz w:val="24"/>
         </w:rPr>
-        <w:t>O gráfico reúne naturezas distintas de informação. A POA provém da medição local agregada, enquanto zenital e incidência são calculados. Os dados integram o acervo PVDAQ (DELINE et al., 2021); o processamento e a seleção são documentados no projeto (TEIXEIRA et al., 2026). Para 17/05, há 96 posições temporais, 94 médias POA não ausentes e 68 intervalos com três amostras na agregação. A figura exibe 05 h a 21 h locais, sem interpolação. A proximidade temporal entre o máximo de POA e a maior altura solar não constitui validação independente do SPA, nem permite identificar isoladamente condições de nuvens, aerossóis ou vapor de água. Trata-se de um exemplo diário, e não de uma distribuição climatológica.</w:t>
+        <w:t xml:space="preserve">O gráfico reúne naturezas distintas de informação. A POA provém da medição local agregada, enquanto zenital e incidência são calculados. Os dados integram o acervo PVDAQ (DELINE </w:t>
+      </w:r>
+      <w:r>
+        <w:rPr>
+          <w:rFonts w:ascii="Times New Roman" w:hAnsi="Times New Roman"/>
+          <w:i w:val="1"/>
+          <w:color w:val="000000"/>
+          <w:sz w:val="24"/>
+          <w:iCs w:val="1"/>
+        </w:rPr>
+        <w:t xml:space="preserve">et al.</w:t>
+      </w:r>
+      <w:r>
+        <w:rPr>
+          <w:rFonts w:ascii="Times New Roman" w:hAnsi="Times New Roman"/>
+          <w:i w:val="0"/>
+          <w:color w:val="000000"/>
+          <w:sz w:val="24"/>
+        </w:rPr>
+        <w:t xml:space="preserve">, 2021); o processamento e a seleção são documentados no projeto (TEIXEIRA </w:t>
+      </w:r>
+      <w:r>
+        <w:rPr>
+          <w:rFonts w:ascii="Times New Roman" w:hAnsi="Times New Roman"/>
+          <w:i w:val="1"/>
+          <w:color w:val="000000"/>
+          <w:sz w:val="24"/>
+          <w:iCs w:val="1"/>
+        </w:rPr>
+        <w:t xml:space="preserve">et al.</w:t>
+      </w:r>
+      <w:r>
+        <w:rPr>
+          <w:rFonts w:ascii="Times New Roman" w:hAnsi="Times New Roman"/>
+          <w:i w:val="0"/>
+          <w:color w:val="000000"/>
+          <w:sz w:val="24"/>
+        </w:rPr>
+        <w:t xml:space="preserve">, 2026). Para 17/05, há 96 posições temporais, 94 médias POA não ausentes e 68 intervalos com três amostras na agregação. A figura exibe 05 h a 21 h locais, sem interpolação. A proximidade temporal entre o máximo de POA e a maior altura solar não constitui validação independente do SPA, nem permite identificar isoladamente condições de nuvens, aerossóis ou vapor de água. Trata-se de um exemplo diário, e não de uma distribuição climatológica.</w:t>
       </w:r>
       <w:r>
         <w:t xml:space="preserve"> Na Figura 2, o zenital é geométrico e a incidência utiliza o zenital aparente, conforme a cadeia computacional vigente.</w:t>
@@ -5041,7 +5160,26 @@
           <w:color w:val="000000"/>
           <w:sz w:val="24"/>
         </w:rPr>
-        <w:t>Os ângulos são calculados pelo SPA de Reda e Andreas (2004; 2008), enquanto a irradiância extraterrestre normal é calculada separadamente pelo método Spencer. A rotina utiliza pvlib 0.16.1. O exemplo publicado do SPA foi reproduzido com os parâmetros da Tabela A5.1 (REDA; ANDREAS, 2008, p. A-15–A-16), obtendo zenital aparente de 50,111622° e azimute de 194,340241°, compatíveis com os valores de referência arredondados. Essa conferência verifica a implementação numérica; não valida o sensor POA nem a precisão de todas as entradas do estudo de caso.</w:t>
+        <w:t xml:space="preserve">Os ângulos são calculados pelo SPA de Reda e Andreas (2004; 2008), enquanto a irradiância extraterrestre normal é calculada separadamente pelo método Spencer. A rotina utiliza </w:t>
+      </w:r>
+      <w:r>
+        <w:rPr>
+          <w:rFonts w:ascii="Times New Roman" w:hAnsi="Times New Roman"/>
+          <w:i w:val="1"/>
+          <w:color w:val="000000"/>
+          <w:sz w:val="24"/>
+          <w:iCs w:val="1"/>
+        </w:rPr>
+        <w:t xml:space="preserve">pvlib</w:t>
+      </w:r>
+      <w:r>
+        <w:rPr>
+          <w:rFonts w:ascii="Times New Roman" w:hAnsi="Times New Roman"/>
+          <w:i w:val="0"/>
+          <w:color w:val="000000"/>
+          <w:sz w:val="24"/>
+        </w:rPr>
+        <w:t xml:space="preserve"> 0.16.1. O exemplo publicado do SPA foi reproduzido com os parâmetros da Tabela A5.1 (REDA; ANDREAS, 2008, p. A-15–A-16), obtendo zenital aparente de 50,111622° e azimute de 194,340241°, compatíveis com os valores de referência arredondados. Essa conferência verifica a implementação numérica; não valida o sensor POA nem a precisão de todas as entradas do estudo de caso.</w:t>
       </w:r>
     </w:p>
     <w:p>
@@ -5073,7 +5211,26 @@
           <w:color w:val="000000"/>
           <w:sz w:val="24"/>
         </w:rPr>
-        <w:t>A conferência bibliográfica foi localizada por páginas, com distinção entre obras catalogadas e evidências efetivamente verificadas. O livro de Duffie, Beckman e Blair (2020, p. 9) apresenta 0,00719 no termo em cos(2B) de sua equação 1.4.1b. O código conferido do pvlib 0.16.1 utiliza 0,000719. Para reproduzir os cálculos do projeto, adota-se este último coeficiente, mantendo registrada a divergência entre as fontes; a comparação não constitui uma investigação de erratas do editor.</w:t>
+        <w:t xml:space="preserve">A conferência bibliográfica foi localizada por páginas, com distinção entre obras catalogadas e evidências efetivamente verificadas. O livro de Duffie, Beckman e Blair (2020, p. 9) apresenta 0,00719 no termo em cos(2B) de sua equação 1.4.1b. O código conferido do </w:t>
+      </w:r>
+      <w:r>
+        <w:rPr>
+          <w:rFonts w:ascii="Times New Roman" w:hAnsi="Times New Roman"/>
+          <w:i w:val="1"/>
+          <w:color w:val="000000"/>
+          <w:sz w:val="24"/>
+          <w:iCs w:val="1"/>
+        </w:rPr>
+        <w:t xml:space="preserve">pvlib</w:t>
+      </w:r>
+      <w:r>
+        <w:rPr>
+          <w:rFonts w:ascii="Times New Roman" w:hAnsi="Times New Roman"/>
+          <w:i w:val="0"/>
+          <w:color w:val="000000"/>
+          <w:sz w:val="24"/>
+        </w:rPr>
+        <w:t xml:space="preserve"> 0.16.1 utiliza 0,000719. Para reproduzir os cálculos do projeto, adota-se este último coeficiente, mantendo registrada a divergência entre as fontes; a comparação não constitui uma investigação de erratas do editor.</w:t>
       </w:r>
       <w:r>
         <w:t xml:space="preserve"> O Quadro 1 sintetiza essas grandezas e convenções.</w:t>
@@ -5131,8 +5288,8 @@
             <w:shd w:fill="F0F0F0"/>
             <w:vAlign w:val="center"/>
             <w:tcMar>
-              <w:top w:w="70" w:type="dxa"/>
-              <w:bottom w:w="70" w:type="dxa"/>
+              <w:top w:w="40" w:type="dxa"/>
+              <w:bottom w:w="40" w:type="dxa"/>
               <w:left w:w="100" w:type="dxa"/>
               <w:right w:w="100" w:type="dxa"/>
             </w:tcMar>
@@ -5142,7 +5299,7 @@
               <w:pStyle w:val="Compact"/>
               <w:keepNext/>
               <w:widowControl/>
-              <w:spacing w:line="240" w:lineRule="auto" w:after="0"/>
+              <w:spacing w:line="240" w:lineRule="auto" w:after="0" w:before="0" w:beforeAutospacing="0" w:afterAutospacing="0"/>
               <w:ind w:firstLine="0"/>
               <w:jc w:val="center"/>
             </w:pPr>
@@ -5164,8 +5321,8 @@
             <w:shd w:fill="F0F0F0"/>
             <w:vAlign w:val="center"/>
             <w:tcMar>
-              <w:top w:w="70" w:type="dxa"/>
-              <w:bottom w:w="70" w:type="dxa"/>
+              <w:top w:w="40" w:type="dxa"/>
+              <w:bottom w:w="40" w:type="dxa"/>
               <w:left w:w="100" w:type="dxa"/>
               <w:right w:w="100" w:type="dxa"/>
             </w:tcMar>
@@ -5175,7 +5332,7 @@
               <w:pStyle w:val="Compact"/>
               <w:keepNext/>
               <w:widowControl/>
-              <w:spacing w:line="240" w:lineRule="auto" w:after="0"/>
+              <w:spacing w:line="240" w:lineRule="auto" w:after="0" w:before="0" w:beforeAutospacing="0" w:afterAutospacing="0"/>
               <w:ind w:firstLine="0"/>
               <w:jc w:val="center"/>
             </w:pPr>
@@ -5197,8 +5354,8 @@
             <w:shd w:fill="F0F0F0"/>
             <w:vAlign w:val="center"/>
             <w:tcMar>
-              <w:top w:w="70" w:type="dxa"/>
-              <w:bottom w:w="70" w:type="dxa"/>
+              <w:top w:w="40" w:type="dxa"/>
+              <w:bottom w:w="40" w:type="dxa"/>
               <w:left w:w="100" w:type="dxa"/>
               <w:right w:w="100" w:type="dxa"/>
             </w:tcMar>
@@ -5208,7 +5365,7 @@
               <w:pStyle w:val="Compact"/>
               <w:keepNext/>
               <w:widowControl/>
-              <w:spacing w:line="240" w:lineRule="auto" w:after="0"/>
+              <w:spacing w:line="240" w:lineRule="auto" w:after="0" w:before="0" w:beforeAutospacing="0" w:afterAutospacing="0"/>
               <w:ind w:firstLine="0"/>
               <w:jc w:val="center"/>
             </w:pPr>
@@ -5234,8 +5391,8 @@
             <w:tcW w:type="dxa" w:w="1191"/>
             <w:vAlign w:val="center"/>
             <w:tcMar>
-              <w:top w:w="70" w:type="dxa"/>
-              <w:bottom w:w="70" w:type="dxa"/>
+              <w:top w:w="40" w:type="dxa"/>
+              <w:bottom w:w="40" w:type="dxa"/>
               <w:left w:w="100" w:type="dxa"/>
               <w:right w:w="100" w:type="dxa"/>
             </w:tcMar>
@@ -5245,7 +5402,7 @@
               <w:pStyle w:val="Compact"/>
               <w:keepNext/>
               <w:widowControl/>
-              <w:spacing w:line="240" w:lineRule="auto" w:after="0"/>
+              <w:spacing w:line="240" w:lineRule="auto" w:after="0" w:before="0" w:beforeAutospacing="0" w:afterAutospacing="0"/>
               <w:ind w:firstLine="0"/>
               <w:jc w:val="center"/>
             </w:pPr>
@@ -5265,8 +5422,8 @@
             <w:tcW w:type="dxa" w:w="4535"/>
             <w:vAlign w:val="center"/>
             <w:tcMar>
-              <w:top w:w="70" w:type="dxa"/>
-              <w:bottom w:w="70" w:type="dxa"/>
+              <w:top w:w="40" w:type="dxa"/>
+              <w:bottom w:w="40" w:type="dxa"/>
               <w:left w:w="100" w:type="dxa"/>
               <w:right w:w="100" w:type="dxa"/>
             </w:tcMar>
@@ -5276,7 +5433,7 @@
               <w:pStyle w:val="Compact"/>
               <w:keepNext/>
               <w:widowControl/>
-              <w:spacing w:line="240" w:lineRule="auto" w:after="0"/>
+              <w:spacing w:line="240" w:lineRule="auto" w:after="0" w:before="0" w:beforeAutospacing="0" w:afterAutospacing="0"/>
               <w:ind w:firstLine="0"/>
               <w:jc w:val="center"/>
             </w:pPr>
@@ -5297,8 +5454,8 @@
             <w:tcW w:type="dxa" w:w="2891"/>
             <w:vAlign w:val="center"/>
             <w:tcMar>
-              <w:top w:w="70" w:type="dxa"/>
-              <w:bottom w:w="70" w:type="dxa"/>
+              <w:top w:w="40" w:type="dxa"/>
+              <w:bottom w:w="40" w:type="dxa"/>
               <w:left w:w="100" w:type="dxa"/>
               <w:right w:w="100" w:type="dxa"/>
             </w:tcMar>
@@ -5308,7 +5465,7 @@
               <w:pStyle w:val="Compact"/>
               <w:keepNext/>
               <w:widowControl/>
-              <w:spacing w:line="240" w:lineRule="auto" w:after="0"/>
+              <w:spacing w:line="240" w:lineRule="auto" w:after="0" w:before="0" w:beforeAutospacing="0" w:afterAutospacing="0"/>
               <w:ind w:firstLine="0"/>
               <w:jc w:val="center"/>
             </w:pPr>
@@ -5334,8 +5491,8 @@
             <w:tcW w:type="dxa" w:w="1191"/>
             <w:vAlign w:val="center"/>
             <w:tcMar>
-              <w:top w:w="70" w:type="dxa"/>
-              <w:bottom w:w="70" w:type="dxa"/>
+              <w:top w:w="40" w:type="dxa"/>
+              <w:bottom w:w="40" w:type="dxa"/>
               <w:left w:w="100" w:type="dxa"/>
               <w:right w:w="100" w:type="dxa"/>
             </w:tcMar>
@@ -5345,7 +5502,7 @@
               <w:pStyle w:val="Compact"/>
               <w:keepNext/>
               <w:widowControl/>
-              <w:spacing w:line="240" w:lineRule="auto" w:after="0"/>
+              <w:spacing w:line="240" w:lineRule="auto" w:after="0" w:before="0" w:beforeAutospacing="0" w:afterAutospacing="0"/>
               <w:ind w:firstLine="0"/>
               <w:jc w:val="center"/>
             </w:pPr>
@@ -5365,8 +5522,8 @@
             <w:tcW w:type="dxa" w:w="4535"/>
             <w:vAlign w:val="center"/>
             <w:tcMar>
-              <w:top w:w="70" w:type="dxa"/>
-              <w:bottom w:w="70" w:type="dxa"/>
+              <w:top w:w="40" w:type="dxa"/>
+              <w:bottom w:w="40" w:type="dxa"/>
               <w:left w:w="100" w:type="dxa"/>
               <w:right w:w="100" w:type="dxa"/>
             </w:tcMar>
@@ -5376,7 +5533,7 @@
               <w:pStyle w:val="Compact"/>
               <w:keepNext/>
               <w:widowControl/>
-              <w:spacing w:line="240" w:lineRule="auto" w:after="0"/>
+              <w:spacing w:line="240" w:lineRule="auto" w:after="0" w:before="0" w:beforeAutospacing="0" w:afterAutospacing="0"/>
               <w:ind w:firstLine="0"/>
               <w:jc w:val="center"/>
             </w:pPr>
@@ -5397,8 +5554,8 @@
             <w:tcW w:type="dxa" w:w="2891"/>
             <w:vAlign w:val="center"/>
             <w:tcMar>
-              <w:top w:w="70" w:type="dxa"/>
-              <w:bottom w:w="70" w:type="dxa"/>
+              <w:top w:w="40" w:type="dxa"/>
+              <w:bottom w:w="40" w:type="dxa"/>
               <w:left w:w="100" w:type="dxa"/>
               <w:right w:w="100" w:type="dxa"/>
             </w:tcMar>
@@ -5408,7 +5565,7 @@
               <w:pStyle w:val="Compact"/>
               <w:keepNext/>
               <w:widowControl/>
-              <w:spacing w:line="240" w:lineRule="auto" w:after="0"/>
+              <w:spacing w:line="240" w:lineRule="auto" w:after="0" w:before="0" w:beforeAutospacing="0" w:afterAutospacing="0"/>
               <w:ind w:firstLine="0"/>
               <w:jc w:val="center"/>
             </w:pPr>
@@ -5434,8 +5591,8 @@
             <w:tcW w:type="dxa" w:w="1191"/>
             <w:vAlign w:val="center"/>
             <w:tcMar>
-              <w:top w:w="70" w:type="dxa"/>
-              <w:bottom w:w="70" w:type="dxa"/>
+              <w:top w:w="40" w:type="dxa"/>
+              <w:bottom w:w="40" w:type="dxa"/>
               <w:left w:w="100" w:type="dxa"/>
               <w:right w:w="100" w:type="dxa"/>
             </w:tcMar>
@@ -5445,7 +5602,7 @@
               <w:pStyle w:val="Compact"/>
               <w:keepNext/>
               <w:widowControl/>
-              <w:spacing w:line="240" w:lineRule="auto" w:after="0"/>
+              <w:spacing w:line="240" w:lineRule="auto" w:after="0" w:before="0" w:beforeAutospacing="0" w:afterAutospacing="0"/>
               <w:ind w:firstLine="0"/>
               <w:jc w:val="center"/>
             </w:pPr>
@@ -5465,8 +5622,8 @@
             <w:tcW w:type="dxa" w:w="4535"/>
             <w:vAlign w:val="center"/>
             <w:tcMar>
-              <w:top w:w="70" w:type="dxa"/>
-              <w:bottom w:w="70" w:type="dxa"/>
+              <w:top w:w="40" w:type="dxa"/>
+              <w:bottom w:w="40" w:type="dxa"/>
               <w:left w:w="100" w:type="dxa"/>
               <w:right w:w="100" w:type="dxa"/>
             </w:tcMar>
@@ -5476,7 +5633,7 @@
               <w:pStyle w:val="Compact"/>
               <w:keepNext/>
               <w:widowControl/>
-              <w:spacing w:line="240" w:lineRule="auto" w:after="0"/>
+              <w:spacing w:line="240" w:lineRule="auto" w:after="0" w:before="0" w:beforeAutospacing="0" w:afterAutospacing="0"/>
               <w:ind w:firstLine="0"/>
               <w:jc w:val="center"/>
             </w:pPr>
@@ -5497,8 +5654,8 @@
             <w:tcW w:type="dxa" w:w="2891"/>
             <w:vAlign w:val="center"/>
             <w:tcMar>
-              <w:top w:w="70" w:type="dxa"/>
-              <w:bottom w:w="70" w:type="dxa"/>
+              <w:top w:w="40" w:type="dxa"/>
+              <w:bottom w:w="40" w:type="dxa"/>
               <w:left w:w="100" w:type="dxa"/>
               <w:right w:w="100" w:type="dxa"/>
             </w:tcMar>
@@ -5508,7 +5665,7 @@
               <w:pStyle w:val="Compact"/>
               <w:keepNext/>
               <w:widowControl/>
-              <w:spacing w:line="240" w:lineRule="auto" w:after="0"/>
+              <w:spacing w:line="240" w:lineRule="auto" w:after="0" w:before="0" w:beforeAutospacing="0" w:afterAutospacing="0"/>
               <w:ind w:firstLine="0"/>
               <w:jc w:val="center"/>
             </w:pPr>
@@ -5534,8 +5691,8 @@
             <w:tcW w:type="dxa" w:w="1191"/>
             <w:vAlign w:val="center"/>
             <w:tcMar>
-              <w:top w:w="70" w:type="dxa"/>
-              <w:bottom w:w="70" w:type="dxa"/>
+              <w:top w:w="40" w:type="dxa"/>
+              <w:bottom w:w="40" w:type="dxa"/>
               <w:left w:w="100" w:type="dxa"/>
               <w:right w:w="100" w:type="dxa"/>
             </w:tcMar>
@@ -5545,7 +5702,7 @@
               <w:pStyle w:val="Compact"/>
               <w:keepNext/>
               <w:widowControl/>
-              <w:spacing w:line="240" w:lineRule="auto" w:after="0"/>
+              <w:spacing w:line="240" w:lineRule="auto" w:after="0" w:before="0" w:beforeAutospacing="0" w:afterAutospacing="0"/>
               <w:ind w:firstLine="0"/>
               <w:jc w:val="center"/>
             </w:pPr>
@@ -5578,8 +5735,8 @@
             <w:tcW w:type="dxa" w:w="4535"/>
             <w:vAlign w:val="center"/>
             <w:tcMar>
-              <w:top w:w="70" w:type="dxa"/>
-              <w:bottom w:w="70" w:type="dxa"/>
+              <w:top w:w="40" w:type="dxa"/>
+              <w:bottom w:w="40" w:type="dxa"/>
               <w:left w:w="100" w:type="dxa"/>
               <w:right w:w="100" w:type="dxa"/>
             </w:tcMar>
@@ -5589,7 +5746,7 @@
               <w:pStyle w:val="Compact"/>
               <w:keepNext/>
               <w:widowControl/>
-              <w:spacing w:line="240" w:lineRule="auto" w:after="0"/>
+              <w:spacing w:line="240" w:lineRule="auto" w:after="0" w:before="0" w:beforeAutospacing="0" w:afterAutospacing="0"/>
               <w:ind w:firstLine="0"/>
               <w:jc w:val="center"/>
             </w:pPr>
@@ -5610,8 +5767,8 @@
             <w:tcW w:type="dxa" w:w="2891"/>
             <w:vAlign w:val="center"/>
             <w:tcMar>
-              <w:top w:w="70" w:type="dxa"/>
-              <w:bottom w:w="70" w:type="dxa"/>
+              <w:top w:w="40" w:type="dxa"/>
+              <w:bottom w:w="40" w:type="dxa"/>
               <w:left w:w="100" w:type="dxa"/>
               <w:right w:w="100" w:type="dxa"/>
             </w:tcMar>
@@ -5621,7 +5778,7 @@
               <w:pStyle w:val="Compact"/>
               <w:keepNext/>
               <w:widowControl/>
-              <w:spacing w:line="240" w:lineRule="auto" w:after="0"/>
+              <w:spacing w:line="240" w:lineRule="auto" w:after="0" w:before="0" w:beforeAutospacing="0" w:afterAutospacing="0"/>
               <w:ind w:firstLine="0"/>
               <w:jc w:val="center"/>
             </w:pPr>
@@ -5647,8 +5804,8 @@
             <w:tcW w:type="dxa" w:w="1191"/>
             <w:vAlign w:val="center"/>
             <w:tcMar>
-              <w:top w:w="70" w:type="dxa"/>
-              <w:bottom w:w="70" w:type="dxa"/>
+              <w:top w:w="40" w:type="dxa"/>
+              <w:bottom w:w="40" w:type="dxa"/>
               <w:left w:w="100" w:type="dxa"/>
               <w:right w:w="100" w:type="dxa"/>
             </w:tcMar>
@@ -5658,7 +5815,7 @@
               <w:pStyle w:val="Compact"/>
               <w:keepNext/>
               <w:widowControl/>
-              <w:spacing w:line="240" w:lineRule="auto" w:after="0"/>
+              <w:spacing w:line="240" w:lineRule="auto" w:after="0" w:before="0" w:beforeAutospacing="0" w:afterAutospacing="0"/>
               <w:ind w:firstLine="0"/>
               <w:jc w:val="center"/>
             </w:pPr>
@@ -5691,8 +5848,8 @@
             <w:tcW w:type="dxa" w:w="4535"/>
             <w:vAlign w:val="center"/>
             <w:tcMar>
-              <w:top w:w="70" w:type="dxa"/>
-              <w:bottom w:w="70" w:type="dxa"/>
+              <w:top w:w="40" w:type="dxa"/>
+              <w:bottom w:w="40" w:type="dxa"/>
               <w:left w:w="100" w:type="dxa"/>
               <w:right w:w="100" w:type="dxa"/>
             </w:tcMar>
@@ -5702,7 +5859,7 @@
               <w:pStyle w:val="Compact"/>
               <w:keepNext/>
               <w:widowControl/>
-              <w:spacing w:line="240" w:lineRule="auto" w:after="0"/>
+              <w:spacing w:line="240" w:lineRule="auto" w:after="0" w:before="0" w:beforeAutospacing="0" w:afterAutospacing="0"/>
               <w:ind w:firstLine="0"/>
               <w:jc w:val="center"/>
             </w:pPr>
@@ -5723,8 +5880,8 @@
             <w:tcW w:type="dxa" w:w="2891"/>
             <w:vAlign w:val="center"/>
             <w:tcMar>
-              <w:top w:w="70" w:type="dxa"/>
-              <w:bottom w:w="70" w:type="dxa"/>
+              <w:top w:w="40" w:type="dxa"/>
+              <w:bottom w:w="40" w:type="dxa"/>
               <w:left w:w="100" w:type="dxa"/>
               <w:right w:w="100" w:type="dxa"/>
             </w:tcMar>
@@ -5734,7 +5891,7 @@
               <w:pStyle w:val="Compact"/>
               <w:keepNext/>
               <w:widowControl/>
-              <w:spacing w:line="240" w:lineRule="auto" w:after="0"/>
+              <w:spacing w:line="240" w:lineRule="auto" w:after="0" w:before="0" w:beforeAutospacing="0" w:afterAutospacing="0"/>
               <w:ind w:firstLine="0"/>
               <w:jc w:val="center"/>
             </w:pPr>
@@ -5825,8 +5982,8 @@
             <w:tcW w:type="dxa" w:w="1191"/>
             <w:vAlign w:val="center"/>
             <w:tcMar>
-              <w:top w:w="70" w:type="dxa"/>
-              <w:bottom w:w="70" w:type="dxa"/>
+              <w:top w:w="40" w:type="dxa"/>
+              <w:bottom w:w="40" w:type="dxa"/>
               <w:left w:w="100" w:type="dxa"/>
               <w:right w:w="100" w:type="dxa"/>
             </w:tcMar>
@@ -5836,7 +5993,7 @@
               <w:pStyle w:val="Compact"/>
               <w:keepNext/>
               <w:widowControl/>
-              <w:spacing w:line="240" w:lineRule="auto" w:after="0"/>
+              <w:spacing w:line="240" w:lineRule="auto" w:after="0" w:before="0" w:beforeAutospacing="0" w:afterAutospacing="0"/>
               <w:ind w:firstLine="0"/>
               <w:jc w:val="center"/>
             </w:pPr>
@@ -5876,8 +6033,8 @@
             <w:tcW w:type="dxa" w:w="4535"/>
             <w:vAlign w:val="center"/>
             <w:tcMar>
-              <w:top w:w="70" w:type="dxa"/>
-              <w:bottom w:w="70" w:type="dxa"/>
+              <w:top w:w="40" w:type="dxa"/>
+              <w:bottom w:w="40" w:type="dxa"/>
               <w:left w:w="100" w:type="dxa"/>
               <w:right w:w="100" w:type="dxa"/>
             </w:tcMar>
@@ -5887,7 +6044,7 @@
               <w:pStyle w:val="Compact"/>
               <w:keepNext/>
               <w:widowControl/>
-              <w:spacing w:line="240" w:lineRule="auto" w:after="0"/>
+              <w:spacing w:line="240" w:lineRule="auto" w:after="0" w:before="0" w:beforeAutospacing="0" w:afterAutospacing="0"/>
               <w:ind w:firstLine="0"/>
               <w:jc w:val="center"/>
             </w:pPr>
@@ -5908,8 +6065,8 @@
             <w:tcW w:type="dxa" w:w="2891"/>
             <w:vAlign w:val="center"/>
             <w:tcMar>
-              <w:top w:w="70" w:type="dxa"/>
-              <w:bottom w:w="70" w:type="dxa"/>
+              <w:top w:w="40" w:type="dxa"/>
+              <w:bottom w:w="40" w:type="dxa"/>
               <w:left w:w="100" w:type="dxa"/>
               <w:right w:w="100" w:type="dxa"/>
             </w:tcMar>
@@ -5919,7 +6076,7 @@
               <w:pStyle w:val="Compact"/>
               <w:keepNext/>
               <w:widowControl/>
-              <w:spacing w:line="240" w:lineRule="auto" w:after="0"/>
+              <w:spacing w:line="240" w:lineRule="auto" w:after="0" w:before="0" w:beforeAutospacing="0" w:afterAutospacing="0"/>
               <w:ind w:firstLine="0"/>
               <w:jc w:val="center"/>
             </w:pPr>
@@ -5945,8 +6102,8 @@
             <w:tcW w:type="dxa" w:w="1191"/>
             <w:vAlign w:val="center"/>
             <w:tcMar>
-              <w:top w:w="70" w:type="dxa"/>
-              <w:bottom w:w="70" w:type="dxa"/>
+              <w:top w:w="40" w:type="dxa"/>
+              <w:bottom w:w="40" w:type="dxa"/>
               <w:left w:w="100" w:type="dxa"/>
               <w:right w:w="100" w:type="dxa"/>
             </w:tcMar>
@@ -5956,7 +6113,7 @@
               <w:pStyle w:val="Compact"/>
               <w:keepNext/>
               <w:widowControl/>
-              <w:spacing w:line="240" w:lineRule="auto" w:after="0"/>
+              <w:spacing w:line="240" w:lineRule="auto" w:after="0" w:before="0" w:beforeAutospacing="0" w:afterAutospacing="0"/>
               <w:ind w:firstLine="0"/>
               <w:jc w:val="center"/>
             </w:pPr>
@@ -5996,8 +6153,8 @@
             <w:tcW w:type="dxa" w:w="4535"/>
             <w:vAlign w:val="center"/>
             <w:tcMar>
-              <w:top w:w="70" w:type="dxa"/>
-              <w:bottom w:w="70" w:type="dxa"/>
+              <w:top w:w="40" w:type="dxa"/>
+              <w:bottom w:w="40" w:type="dxa"/>
               <w:left w:w="100" w:type="dxa"/>
               <w:right w:w="100" w:type="dxa"/>
             </w:tcMar>
@@ -6007,7 +6164,7 @@
               <w:pStyle w:val="Compact"/>
               <w:keepNext/>
               <w:widowControl/>
-              <w:spacing w:line="240" w:lineRule="auto" w:after="0"/>
+              <w:spacing w:line="240" w:lineRule="auto" w:after="0" w:before="0" w:beforeAutospacing="0" w:afterAutospacing="0"/>
               <w:ind w:firstLine="0"/>
               <w:jc w:val="center"/>
             </w:pPr>
@@ -6028,8 +6185,8 @@
             <w:tcW w:type="dxa" w:w="2891"/>
             <w:vAlign w:val="center"/>
             <w:tcMar>
-              <w:top w:w="70" w:type="dxa"/>
-              <w:bottom w:w="70" w:type="dxa"/>
+              <w:top w:w="40" w:type="dxa"/>
+              <w:bottom w:w="40" w:type="dxa"/>
               <w:left w:w="100" w:type="dxa"/>
               <w:right w:w="100" w:type="dxa"/>
             </w:tcMar>
@@ -6039,7 +6196,7 @@
               <w:pStyle w:val="Compact"/>
               <w:keepNext/>
               <w:widowControl/>
-              <w:spacing w:line="240" w:lineRule="auto" w:after="0"/>
+              <w:spacing w:line="240" w:lineRule="auto" w:after="0" w:before="0" w:beforeAutospacing="0" w:afterAutospacing="0"/>
               <w:ind w:firstLine="0"/>
               <w:jc w:val="center"/>
             </w:pPr>
@@ -6065,8 +6222,8 @@
             <w:tcW w:type="dxa" w:w="1191"/>
             <w:vAlign w:val="center"/>
             <w:tcMar>
-              <w:top w:w="70" w:type="dxa"/>
-              <w:bottom w:w="70" w:type="dxa"/>
+              <w:top w:w="40" w:type="dxa"/>
+              <w:bottom w:w="40" w:type="dxa"/>
               <w:left w:w="100" w:type="dxa"/>
               <w:right w:w="100" w:type="dxa"/>
             </w:tcMar>
@@ -6076,7 +6233,7 @@
               <w:pStyle w:val="Compact"/>
               <w:keepNext/>
               <w:widowControl/>
-              <w:spacing w:line="240" w:lineRule="auto" w:after="0"/>
+              <w:spacing w:line="240" w:lineRule="auto" w:after="0" w:before="0" w:beforeAutospacing="0" w:afterAutospacing="0"/>
               <w:ind w:firstLine="0"/>
               <w:jc w:val="center"/>
             </w:pPr>
@@ -6097,8 +6254,8 @@
             <w:tcW w:type="dxa" w:w="4535"/>
             <w:vAlign w:val="center"/>
             <w:tcMar>
-              <w:top w:w="70" w:type="dxa"/>
-              <w:bottom w:w="70" w:type="dxa"/>
+              <w:top w:w="40" w:type="dxa"/>
+              <w:bottom w:w="40" w:type="dxa"/>
               <w:left w:w="100" w:type="dxa"/>
               <w:right w:w="100" w:type="dxa"/>
             </w:tcMar>
@@ -6108,7 +6265,7 @@
               <w:pStyle w:val="Compact"/>
               <w:keepNext/>
               <w:widowControl/>
-              <w:spacing w:line="240" w:lineRule="auto" w:after="0"/>
+              <w:spacing w:line="240" w:lineRule="auto" w:after="0" w:before="0" w:beforeAutospacing="0" w:afterAutospacing="0"/>
               <w:ind w:firstLine="0"/>
               <w:jc w:val="center"/>
             </w:pPr>
@@ -6129,8 +6286,8 @@
             <w:tcW w:type="dxa" w:w="2891"/>
             <w:vAlign w:val="center"/>
             <w:tcMar>
-              <w:top w:w="70" w:type="dxa"/>
-              <w:bottom w:w="70" w:type="dxa"/>
+              <w:top w:w="40" w:type="dxa"/>
+              <w:bottom w:w="40" w:type="dxa"/>
               <w:left w:w="100" w:type="dxa"/>
               <w:right w:w="100" w:type="dxa"/>
             </w:tcMar>
@@ -6140,7 +6297,7 @@
               <w:pStyle w:val="Compact"/>
               <w:keepNext/>
               <w:widowControl/>
-              <w:spacing w:line="240" w:lineRule="auto" w:after="0"/>
+              <w:spacing w:line="240" w:lineRule="auto" w:after="0" w:before="0" w:beforeAutospacing="0" w:afterAutospacing="0"/>
               <w:ind w:firstLine="0"/>
               <w:jc w:val="center"/>
             </w:pPr>
@@ -6264,7 +6421,18 @@
           <w:color w:val="000000"/>
           <w:sz w:val="24"/>
         </w:rPr>
-        <w:t>Photovoltaic Data Acquisition (PVDAQ) Public Datasets</w:t>
+        <w:t xml:space="preserve">Photovoltaic Data Acquisition (PVDAQ) </w:t>
+      </w:r>
+      <w:r>
+        <w:rPr>
+          <w:rFonts w:ascii="Times New Roman" w:hAnsi="Times New Roman"/>
+          <w:b/>
+          <w:i w:val="1"/>
+          <w:color w:val="000000"/>
+          <w:sz w:val="24"/>
+          <w:iCs w:val="1"/>
+        </w:rPr>
+        <w:t xml:space="preserve">Public Datasets</w:t>
       </w:r>
       <w:r>
         <w:rPr>
@@ -6298,11 +6466,12 @@
         <w:rPr>
           <w:rFonts w:ascii="Times New Roman" w:hAnsi="Times New Roman"/>
           <w:b/>
-          <w:i w:val="0"/>
-          <w:color w:val="000000"/>
-          <w:sz w:val="24"/>
-        </w:rPr>
-        <w:t>Solar engineering of thermal processes, photovoltaics and wind</w:t>
+          <w:i w:val="1"/>
+          <w:color w:val="000000"/>
+          <w:sz w:val="24"/>
+          <w:iCs w:val="1"/>
+        </w:rPr>
+        <w:t xml:space="preserve">Solar engineering of thermal processes, photovoltaics and wind</w:t>
       </w:r>
       <w:r>
         <w:rPr>
@@ -6336,11 +6505,12 @@
         <w:rPr>
           <w:rFonts w:ascii="Times New Roman" w:hAnsi="Times New Roman"/>
           <w:b/>
-          <w:i w:val="0"/>
-          <w:color w:val="000000"/>
-          <w:sz w:val="24"/>
-        </w:rPr>
-        <w:t>General solar position calculations</w:t>
+          <w:i w:val="1"/>
+          <w:color w:val="000000"/>
+          <w:sz w:val="24"/>
+          <w:iCs w:val="1"/>
+        </w:rPr>
+        <w:t xml:space="preserve">General solar position calculations</w:t>
       </w:r>
       <w:r>
         <w:rPr>
@@ -6374,11 +6544,43 @@
         <w:rPr>
           <w:rFonts w:ascii="Times New Roman" w:hAnsi="Times New Roman"/>
           <w:b/>
-          <w:i w:val="0"/>
-          <w:color w:val="000000"/>
-          <w:sz w:val="24"/>
-        </w:rPr>
-        <w:t>pvlib python: get_extra_radiation e spa_python</w:t>
+          <w:i w:val="1"/>
+          <w:color w:val="000000"/>
+          <w:sz w:val="24"/>
+          <w:iCs w:val="1"/>
+        </w:rPr>
+        <w:t xml:space="preserve">pvlib</w:t>
+      </w:r>
+      <w:r>
+        <w:rPr>
+          <w:rFonts w:ascii="Times New Roman" w:hAnsi="Times New Roman"/>
+          <w:b/>
+          <w:i w:val="0"/>
+          <w:color w:val="000000"/>
+          <w:sz w:val="24"/>
+        </w:rPr>
+        <w:t xml:space="preserve"> </w:t>
+      </w:r>
+      <w:r>
+        <w:rPr>
+          <w:rFonts w:ascii="Times New Roman" w:hAnsi="Times New Roman"/>
+          <w:b/>
+          <w:i w:val="1"/>
+          <w:color w:val="000000"/>
+          <w:sz w:val="24"/>
+          <w:iCs w:val="1"/>
+        </w:rPr>
+        <w:t xml:space="preserve">python</w:t>
+      </w:r>
+      <w:r>
+        <w:rPr>
+          <w:rFonts w:ascii="Times New Roman" w:hAnsi="Times New Roman"/>
+          <w:b/>
+          <w:i w:val="0"/>
+          <w:color w:val="000000"/>
+          <w:sz w:val="24"/>
+        </w:rPr>
+        <w:t xml:space="preserve">: get_extra_radiation e spa_python</w:t>
       </w:r>
       <w:r>
         <w:rPr>
@@ -6406,17 +6608,39 @@
           <w:color w:val="000000"/>
           <w:sz w:val="24"/>
         </w:rPr>
-        <w:t xml:space="preserve">REDA, Ibrahim; ANDREAS, Afshin. Solar position algorithm for solar radiation applications. </w:t>
+        <w:t xml:space="preserve">REDA, Ibrahim; ANDREAS, Afshin. </w:t>
+      </w:r>
+      <w:r>
+        <w:rPr>
+          <w:rFonts w:ascii="Times New Roman" w:hAnsi="Times New Roman"/>
+          <w:b w:val="0"/>
+          <w:i w:val="1"/>
+          <w:color w:val="000000"/>
+          <w:sz w:val="24"/>
+          <w:iCs w:val="1"/>
+        </w:rPr>
+        <w:t xml:space="preserve">Solar position algorithm for solar radiation applications</w:t>
+      </w:r>
+      <w:r>
+        <w:rPr>
+          <w:rFonts w:ascii="Times New Roman" w:hAnsi="Times New Roman"/>
+          <w:b w:val="0"/>
+          <w:i w:val="0"/>
+          <w:color w:val="000000"/>
+          <w:sz w:val="24"/>
+        </w:rPr>
+        <w:t xml:space="preserve">. </w:t>
       </w:r>
       <w:r>
         <w:rPr>
           <w:rFonts w:ascii="Times New Roman" w:hAnsi="Times New Roman"/>
           <w:b/>
-          <w:i w:val="0"/>
-          <w:color w:val="000000"/>
-          <w:sz w:val="24"/>
-        </w:rPr>
-        <w:t>Solar Energy</w:t>
+          <w:i w:val="1"/>
+          <w:color w:val="000000"/>
+          <w:sz w:val="24"/>
+          <w:iCs w:val="1"/>
+        </w:rPr>
+        <w:t xml:space="preserve">Solar Energy</w:t>
       </w:r>
       <w:r>
         <w:rPr>
@@ -6450,11 +6674,12 @@
         <w:rPr>
           <w:rFonts w:ascii="Times New Roman" w:hAnsi="Times New Roman"/>
           <w:b/>
-          <w:i w:val="0"/>
-          <w:color w:val="000000"/>
-          <w:sz w:val="24"/>
-        </w:rPr>
-        <w:t>Solar position algorithm for solar radiation applications</w:t>
+          <w:i w:val="1"/>
+          <w:color w:val="000000"/>
+          <w:sz w:val="24"/>
+          <w:iCs w:val="1"/>
+        </w:rPr>
+        <w:t xml:space="preserve">Solar position algorithm for solar radiation applications</w:t>
       </w:r>
       <w:r>
         <w:rPr>
@@ -6464,7 +6689,28 @@
           <w:color w:val="000000"/>
           <w:sz w:val="24"/>
         </w:rPr>
-        <w:t>. Revised January 2008. Golden: National Renewable Energy Laboratory, 2008. Relatório NREL/TP-560-34302. DOI: https://doi.org/10.2172/15003974.</w:t>
+        <w:t xml:space="preserve">. </w:t>
+      </w:r>
+      <w:r>
+        <w:rPr>
+          <w:rFonts w:ascii="Times New Roman" w:hAnsi="Times New Roman"/>
+          <w:b w:val="0"/>
+          <w:i w:val="1"/>
+          <w:color w:val="000000"/>
+          <w:sz w:val="24"/>
+          <w:iCs w:val="1"/>
+        </w:rPr>
+        <w:t xml:space="preserve">Revised January 2008</w:t>
+      </w:r>
+      <w:r>
+        <w:rPr>
+          <w:rFonts w:ascii="Times New Roman" w:hAnsi="Times New Roman"/>
+          <w:b w:val="0"/>
+          <w:i w:val="0"/>
+          <w:color w:val="000000"/>
+          <w:sz w:val="24"/>
+        </w:rPr>
+        <w:t xml:space="preserve">. Golden: National Renewable Energy Laboratory, 2008. Relatório NREL/TP-560-34302. DOI: https://doi.org/10.2172/15003974.</w:t>
       </w:r>
     </w:p>
     <w:p>
@@ -6482,17 +6728,39 @@
           <w:color w:val="000000"/>
           <w:sz w:val="24"/>
         </w:rPr>
-        <w:t xml:space="preserve">SENGUPTA, Manajit et al. (ed.). </w:t>
+        <w:t xml:space="preserve">SENGUPTA, Manajit </w:t>
+      </w:r>
+      <w:r>
+        <w:rPr>
+          <w:rFonts w:ascii="Times New Roman" w:hAnsi="Times New Roman"/>
+          <w:b w:val="0"/>
+          <w:i w:val="1"/>
+          <w:color w:val="000000"/>
+          <w:sz w:val="24"/>
+          <w:iCs w:val="1"/>
+        </w:rPr>
+        <w:t xml:space="preserve">et al.</w:t>
+      </w:r>
+      <w:r>
+        <w:rPr>
+          <w:rFonts w:ascii="Times New Roman" w:hAnsi="Times New Roman"/>
+          <w:b w:val="0"/>
+          <w:i w:val="0"/>
+          <w:color w:val="000000"/>
+          <w:sz w:val="24"/>
+        </w:rPr>
+        <w:t xml:space="preserve"> (ed.). </w:t>
       </w:r>
       <w:r>
         <w:rPr>
           <w:rFonts w:ascii="Times New Roman" w:hAnsi="Times New Roman"/>
           <w:b/>
-          <w:i w:val="0"/>
-          <w:color w:val="000000"/>
-          <w:sz w:val="24"/>
-        </w:rPr>
-        <w:t>Best practices handbook for the collection and use of solar resource data for solar energy applications</w:t>
+          <w:i w:val="1"/>
+          <w:color w:val="000000"/>
+          <w:sz w:val="24"/>
+          <w:iCs w:val="1"/>
+        </w:rPr>
+        <w:t xml:space="preserve">Best practices handbook for the collection and use of solar resource data for solar energy applications</w:t>
       </w:r>
       <w:r>
         <w:rPr>
@@ -6520,7 +6788,28 @@
           <w:color w:val="000000"/>
           <w:sz w:val="24"/>
         </w:rPr>
-        <w:t xml:space="preserve">TEIXEIRA, Samuel Constantino et al. </w:t>
+        <w:t xml:space="preserve">TEIXEIRA, Samuel Constantino </w:t>
+      </w:r>
+      <w:r>
+        <w:rPr>
+          <w:rFonts w:ascii="Times New Roman" w:hAnsi="Times New Roman"/>
+          <w:b w:val="0"/>
+          <w:i w:val="1"/>
+          <w:color w:val="000000"/>
+          <w:sz w:val="24"/>
+          <w:iCs w:val="1"/>
+        </w:rPr>
+        <w:t xml:space="preserve">et al.</w:t>
+      </w:r>
+      <w:r>
+        <w:rPr>
+          <w:rFonts w:ascii="Times New Roman" w:hAnsi="Times New Roman"/>
+          <w:b w:val="0"/>
+          <w:i w:val="0"/>
+          <w:color w:val="000000"/>
+          <w:sz w:val="24"/>
+        </w:rPr>
+        <w:t xml:space="preserve"> </w:t>
       </w:r>
       <w:r>
         <w:rPr>

</xml_diff>